<commit_message>
docs: GK-38 adiciona links dos documentos no Drive e ajusta coluna Concluido na DoD
</commit_message>
<xml_diff>
--- a/docs/DoR-e-DoD.docx
+++ b/docs/DoR-e-DoD.docx
@@ -150,7 +150,7 @@
         <w:spacing w:after="120"/>
       </w:pPr>
       <w:r>
-        <w:t xml:space="preserve">Uma história só vai para Feito no Jira quando:</w:t>
+        <w:t xml:space="preserve">Uma história só vai para Concluído no Jira quando:</w:t>
       </w:r>
     </w:p>
     <w:p>
@@ -468,7 +468,7 @@
                 <w:b w:val="false"/>
                 <w:bCs w:val="false"/>
               </w:rPr>
-              <w:t xml:space="preserve">Testa os cenários e confere a DoD antes de mover para Feito</w:t>
+              <w:t xml:space="preserve">Testa os cenários e confere a DoD antes de mover para Concluído</w:t>
             </w:r>
           </w:p>
         </w:tc>

</xml_diff>